<commit_message>
Document live unattended Codex acceptance and publish the reviewed A4 brief
</commit_message>
<xml_diff>
--- a/docs/pl/opis-dla-szefa.docx
+++ b/docs/pl/opis-dla-szefa.docx
@@ -19,12 +19,12 @@
           <w:color w:val="555555"/>
           <w:sz w:val="18"/>
         </w:rPr>
-        <w:t>Informacja dla kierownictwa  •  24 października 2026  •  wersja 0.2.1</w:t>
+        <w:t>Informacja dla kierownictwa  •  24 października 2026  •  wersja 0.3.0</w:t>
       </w:r>
     </w:p>
     <w:p>
       <w:r>
-        <w:t>Uruchomiliśmy eksperymentalny most do zlecania prac agentom AI w Paperclip i odbierania sprawdzonych wyników przez MCP. Pełny test z agentem Codex zakończył się wykonaniem kodu, odbiorem plików, niezależnymi testami i zatwierdzeniem. Rekomendujemy dalszy pilot na małych, publicznych lub syntetycznych zadaniach.</w:t>
+        <w:t>Zautomatyzowaliśmy obieg małych zadań agentów Codex w Paperclip: odbiór plików, niezależne testy i obsługę naprawy po zakończeniu procesu. Próby syntetyczne mogą także zakończyć się automatycznym zatwierdzeniem według wcześniej ustalonych reguł. Projekt pozostaje pilotem; rekomendujemy użycie na publicznych lub syntetycznych zadaniach.</w:t>
       </w:r>
     </w:p>
     <w:p>
@@ -50,7 +50,7 @@
     </w:p>
     <w:p>
       <w:r>
-        <w:t>Klient MCP przekazuje specyfikację do trwałego dziennika. Paperclip uruchamia wskazanego wykonawcę. Odbiornik kopiuje dozwolone pliki i wiąże ich skróty SHA256 z konkretnym zadaniem oraz uruchomieniem. Osobny weryfikator testuje kopię bez poświadczeń agenta i z blokadą sieci. Koordynator przegląda dokładnie ten wynik i zatwierdza go przez MCP. Dopiero potwierdzone zamknięcie w Paperclip zwalnia blokady plików.</w:t>
+        <w:t>Klient MCP przekazuje specyfikację do trwałego dziennika. Paperclip uruchamia wskazanego wykonawcę. Odbiornik kopiuje dozwolone pliki i wiąże ich skróty SHA256 z konkretnym zadaniem oraz uruchomieniem. Osobny weryfikator testuje kopię bez poświadczeń agenta i z blokadą sieci. Koordynator przegląda dokładnie ten wynik przez MCP. Zaufana polityka może zaakceptować wcześniej zatwierdzone pliki syntetyczne. Dopiero potwierdzone zamknięcie w Paperclip zwalnia blokady plików.</w:t>
       </w:r>
     </w:p>
     <w:p>
@@ -63,7 +63,7 @@
     </w:p>
     <w:p>
       <w:r>
-        <w:t>Codex przygotował moduł formatujący sekundy jako HH:MM:SS, testy oraz raport. Odebrano wszystkie trzy pliki. Testy przeszły w izolowanym środowisku K3s i lokalnie; dodatkowa kontrola objęła 400 001 wartości i bardzo dużą liczbę. Zatwierdzony manifest odpowiada odebranym plikom, a zadanie osiągnęło Done. Biblioteka mostu ma 198 przechodzących testów. Odbiór natywnego Codex w tym pilocie wymagał operatora; automatyczny odbiornik dotyczy obecnie Antigravity.</w:t>
+        <w:t>Poprawny wynik i wynik po rzeczywistej naprawie dyspozycji osiągnęły Done bez ręcznego odbioru lub akceptacji. Naprawa nie uruchomiła ponownie modelu. Celowo błędne testy zatrzymały trzeci wynik, a restart nie powielił zatwierdzeń. Testy mostu: 376 PASS na Linuksie. Kopie plików zwrócone przez MCP zgadzają się bajt w bajt z testowanymi. Są to wcześniej zatwierdzone próbki syntetyczne; nie dowód automatycznej oceny dowolnego nowego programu.</w:t>
       </w:r>
     </w:p>
     <w:p>
@@ -89,7 +89,7 @@
     </w:p>
     <w:p>
       <w:r>
-        <w:t>Wartość stanowi kontrolowany, możliwy do prześledzenia obieg zlecenia i plików. Następny etap to automatyzacja odbioru Codex, pewne parkowanie zadania do przeglądu oraz pomiar czasu, kosztu i liczby poprawek. Nie zmierzono jeszcze zwrotu z inwestycji. Obecny etap nie uzasadnia pełnej autonomii produkcyjnej ani przekazywania dokumentów poufnych.</w:t>
+        <w:t>Wartość stanowi kontrolowany, możliwy do prześledzenia obieg zlecenia i plików. Kolejny etap to pomiar czasu, kosztu i liczby poprawek oraz rozszerzanie zakresu na podstawie wyników pilota. Zwykły nowy kod nadal wymaga przeglądu koordynatora; automatyczna akceptacja obejmuje wyłącznie ściśle określone próby syntetyczne. Nie zmierzono jeszcze zwrotu z inwestycji. Obecny etap nie uzasadnia pełnej autonomii produkcyjnej ani przekazywania dokumentów poufnych.</w:t>
       </w:r>
     </w:p>
     <w:p>

</xml_diff>

<commit_message>
Add bounded pre-provider recovery and durable native reconciliation
</commit_message>
<xml_diff>
--- a/docs/pl/opis-dla-szefa.docx
+++ b/docs/pl/opis-dla-szefa.docx
@@ -19,12 +19,12 @@
           <w:color w:val="555555"/>
           <w:sz w:val="18"/>
         </w:rPr>
-        <w:t>Informacja dla kierownictwa  •  24 października 2026  •  wersja 0.3.0</w:t>
+        <w:t>Informacja dla kierownictwa  •  25 października 2026  •  wersja 0.4.0</w:t>
       </w:r>
     </w:p>
     <w:p>
       <w:r>
-        <w:t>Zautomatyzowaliśmy obieg małych zadań agentów Codex w Paperclip: odbiór plików, niezależne testy i obsługę naprawy po zakończeniu procesu. Próby syntetyczne mogą także zakończyć się automatycznym zatwierdzeniem według wcześniej ustalonych reguł. Projekt pozostaje pilotem; rekomendujemy użycie na publicznych lub syntetycznych zadaniach.</w:t>
+        <w:t>Rozwinęliśmy most, który łączy zlecanie pracy agentom Codex i Antigravity z odbiorem plików, niezależnymi testami i zatwierdzeniem w Paperclip. Wersja 0.4.0 dodaje automatyczne recovery po potwierdzonej awarii przed uruchomieniem modelu. Projekt pozostaje pilotem dla małych zadań na publicznym kodzie.</w:t>
       </w:r>
     </w:p>
     <w:p>
@@ -37,7 +37,7 @@
     </w:p>
     <w:p>
       <w:r>
-        <w:t>Agent wsadowy kończy proces i traci bieżące połączenie, ale zlecenie, pytania i wyniki muszą pozostać dostępne. Most zachowuje ten kontekst i pilnuje zakresu plików. Ułatwia delegowanie prac programistycznych oraz ich kontrolę. Pozwala odróżnić deklarację „gotowe” od wyniku, który rzeczywiście odebrano i sprawdzono.</w:t>
+        <w:t>Agent wsadowy kończy proces, ale jego zlecenie, pytania, odpowiedzi i wyniki muszą pozostać dostępne. Most przechowuje ten kontekst i pilnuje zakresu plików. Pozwala zlecać różnym wykonawcom części jednej pracy oraz sprawdzić, czy wynik rzeczywiście odebrano, przetestowano i zatwierdzono.</w:t>
       </w:r>
     </w:p>
     <w:p>
@@ -50,7 +50,7 @@
     </w:p>
     <w:p>
       <w:r>
-        <w:t>Klient MCP przekazuje specyfikację do trwałego dziennika. Paperclip uruchamia wskazanego wykonawcę. Odbiornik kopiuje dozwolone pliki i wiąże ich skróty SHA256 z konkretnym zadaniem oraz uruchomieniem. Osobny weryfikator testuje kopię bez poświadczeń agenta i z blokadą sieci. Koordynator przegląda dokładnie ten wynik przez MCP. Zaufana polityka może zaakceptować wcześniej zatwierdzone pliki syntetyczne. Dopiero potwierdzone zamknięcie w Paperclip zwalnia blokady plików.</w:t>
+        <w:t>Klient MCP zapisuje specyfikację w trwałym dzienniku. Paperclip uruchamia wykonawcę. Odbiornik wiąże dozwolone pliki i ich skróty SHA256 z konkretną próbą. Osobny sandbox sprawdza kopię bez poświadczeń agenta i z blokadą sieci. Koordynator przegląda dokładnie ten wynik; potwierdzone Done w Paperclip zwalnia blokady. Oryginalny Concord utrzymuje opcjonalny wspólny kontekst i wiadomości przez jawne proxy nadzorcy.</w:t>
       </w:r>
     </w:p>
     <w:p>
@@ -58,12 +58,12 @@
         <w:pStyle w:val="Heading1"/>
       </w:pPr>
       <w:r>
-        <w:t>Co potwierdziliśmy</w:t>
+        <w:t>Co daje recovery</w:t>
       </w:r>
     </w:p>
     <w:p>
       <w:r>
-        <w:t>Poprawny wynik i wynik po rzeczywistej naprawie dyspozycji osiągnęły Done bez ręcznego odbioru lub akceptacji. Naprawa nie uruchomiła ponownie modelu. Celowo błędne testy zatrzymały trzeci wynik, a restart nie powielił zatwierdzeń. Testy mostu: 376 PASS na Linuksie. Kopie plików zwrócone przez MCP zgadzają się bajt w bajt z testowanymi. Są to wcześniej zatwierdzone próbki syntetyczne; nie dowód automatycznej oceny dowolnego nowego programu.</w:t>
+        <w:t>System sam podejmuje pracę po udowodnionej awarii przed modelem, zachowując tę samą sprawę i historię prób. Najpierw trwale rezerwuje ponowienie. Po restarcie sprawdza aktualne dowody, a po utracie odpowiedzi API szuka rzeczywistego następcy zamiast ponawiać żądanie. Polityka administratora ogranicza repozytoria, wykonawcę i liczbę prób. Timeout bez dowodu braku skutków, błędy logowania, limity i pauza zatrzymują automatyzację.</w:t>
       </w:r>
     </w:p>
     <w:p>
@@ -71,12 +71,12 @@
         <w:pStyle w:val="Heading1"/>
       </w:pPr>
       <w:r>
-        <w:t>Z czego rozwinęliśmy projekt</w:t>
+        <w:t>Co sprawdziliśmy</w:t>
       </w:r>
     </w:p>
     <w:p>
       <w:r>
-        <w:t>Punktem wyjścia był otwarty Concord MCP oraz koncepcja współpracy agentów omówiona z Gemini. Zbudowaliśmy niezależny adapter w Pythonie z oficjalnym SDK MCP, SQLite i natywnym API Paperclip. Nie jest to fork Concord ani wdrożony generator Gemini. Oryginalny Concord 0.16.0 sprawdzono jako opcjonalny wspólny rejestr metadanych; wykonaniem nadal zarządza Paperclip.</w:t>
+        <w:t>Codex przygotował dziennik i kontroler, a Antigravity politykę oraz weryfikację dowodów. Odebraliśmy ich pliki i przejrzeliśmy integrację. Próba na rzeczywistym Paperclip objęła awarię przed modelem, przerwanie odbiornika po rezerwacji i utratę odpowiedzi po przyjętym recovery. Odebraliśmy nowe pliki wykonawcy, niezależne testy przeszły, a wynik został formalnie zatwierdzony. Od kontrolowanej awarii do odbioru nie naprawialiśmy ręcznie stanów ani usług. Szczegółowe wyniki i ograniczenia zawiera raport automatycznego recovery.</w:t>
       </w:r>
     </w:p>
     <w:p>
@@ -84,12 +84,12 @@
         <w:pStyle w:val="Heading1"/>
       </w:pPr>
       <w:r>
-        <w:t>Sens dalszego rozwoju</w:t>
+        <w:t>Pochodzenie i dalsze zastosowanie</w:t>
       </w:r>
     </w:p>
     <w:p>
       <w:r>
-        <w:t>Wartość stanowi kontrolowany, możliwy do prześledzenia obieg zlecenia i plików. Kolejny etap to pomiar czasu, kosztu i liczby poprawek oraz rozszerzanie zakresu na podstawie wyników pilota. Zwykły nowy kod nadal wymaga przeglądu koordynatora; automatyczna akceptacja obejmuje wyłącznie ściśle określone próby syntetyczne. Nie zmierzono jeszcze zwrotu z inwestycji. Obecny etap nie uzasadnia pełnej autonomii produkcyjnej ani przekazywania dokumentów poufnych.</w:t>
+        <w:t>Inspiracją był otwarty Concord MCP i koncepcja współpracy omówiona z Gemini. Zbudowaliśmy niezależny adapter Python z oficjalnym SDK MCP, SQLite i API Paperclip. Kod nie jest forkiem Concord. Wartością jest audytowalny obieg oraz mniej napraw operacyjnych. Dalszy rozwój powinien mierzyć czas, koszt i liczbę poprawek. Nowy kod nadal wymaga przeglądu koordynatora; nie potwierdziliśmy pełnej autonomii produkcyjnej ani bezpieczeństwa pracy na dokumentach poufnych.</w:t>
       </w:r>
     </w:p>
     <w:p>

</xml_diff>